<commit_message>
v445.3.2: Fachquellen, Fristen und offene Beiträge bereinigen
</commit_message>
<xml_diff>
--- a/testakten/zivilprozess-werkvertragsstreit-saalbau-rosenheim-bgh-revision-pohlmann/12-urteil-lg-traunstein-1-o-2188-25.docx
+++ b/testakten/zivilprozess-werkvertragsstreit-saalbau-rosenheim-bgh-revision-pohlmann/12-urteil-lg-traunstein-1-o-2188-25.docx
@@ -118,13 +118,21 @@
     <w:p>
       <w:pPr>
         <w:pStyle w:val="Heading2"/>
+        <w:keepNext/>
+        <w:spacing w:after="0"/>
       </w:pPr>
       <w:r>
         <w:rPr>
           <w:rFonts w:ascii="Times New Roman" w:hAnsi="Times New Roman"/>
         </w:rPr>
-        <w:t>Tenor</w:t>
+        <w:t>1 Tenor</w:t>
       </w:r>
+    </w:p>
+    <w:p>
+      <w:pPr>
+        <w:keepNext/>
+        <w:spacing w:before="0" w:after="0" w:line="220" w:lineRule="exact"/>
+      </w:pPr>
     </w:p>
     <w:p>
       <w:pPr>
@@ -134,7 +142,7 @@
         <w:rPr>
           <w:b/>
         </w:rPr>
-        <w:t>I.</w:t>
+        <w:t>1.1</w:t>
       </w:r>
       <w:r>
         <w:t xml:space="preserve"> Die Beklagte wird verurteilt, an die Klägerin </w:t>
@@ -157,7 +165,7 @@
         <w:rPr>
           <w:b/>
         </w:rPr>
-        <w:t>II.</w:t>
+        <w:t>1.2</w:t>
       </w:r>
       <w:r>
         <w:t xml:space="preserve"> Im Übrigen wird die Klage abgewiesen.</w:t>
@@ -171,7 +179,7 @@
         <w:rPr>
           <w:b/>
         </w:rPr>
-        <w:t>III.</w:t>
+        <w:t>1.3</w:t>
       </w:r>
       <w:r>
         <w:t xml:space="preserve"> Von den Kosten des Rechtsstreits trägt die Klägerin 25 %, die Beklagte 75 %.</w:t>
@@ -185,7 +193,7 @@
         <w:rPr>
           <w:b/>
         </w:rPr>
-        <w:t>IV.</w:t>
+        <w:t>1.4</w:t>
       </w:r>
       <w:r>
         <w:t xml:space="preserve"> Das Urteil ist gegen Sicherheitsleistung in Höhe von 110 % des jeweils zu vollstreckenden Betrages vorläufig vollstreckbar.</w:t>
@@ -199,7 +207,7 @@
         <w:rPr>
           <w:b/>
         </w:rPr>
-        <w:t>V.</w:t>
+        <w:t>1.5</w:t>
       </w:r>
       <w:r>
         <w:t xml:space="preserve"> Der Streitwert wird auf 684.400 EUR festgesetzt.</w:t>
@@ -209,13 +217,21 @@
     <w:p>
       <w:pPr>
         <w:pStyle w:val="Heading2"/>
+        <w:keepNext/>
+        <w:spacing w:after="0"/>
       </w:pPr>
       <w:r>
         <w:rPr>
           <w:rFonts w:ascii="Times New Roman" w:hAnsi="Times New Roman"/>
         </w:rPr>
-        <w:t>Tatbestand (Kurzfassung)</w:t>
+        <w:t>2 Tatbestand (Kurzfassung)</w:t>
       </w:r>
+    </w:p>
+    <w:p>
+      <w:pPr>
+        <w:keepNext/>
+        <w:spacing w:before="0" w:after="0" w:line="220" w:lineRule="exact"/>
+      </w:pPr>
     </w:p>
     <w:p>
       <w:pPr>
@@ -229,24 +245,40 @@
     <w:p>
       <w:pPr>
         <w:pStyle w:val="Heading2"/>
+        <w:keepNext/>
+        <w:spacing w:after="0"/>
       </w:pPr>
       <w:r>
         <w:rPr>
           <w:rFonts w:ascii="Times New Roman" w:hAnsi="Times New Roman"/>
         </w:rPr>
-        <w:t>Entscheidungsgründe</w:t>
+        <w:t>3 Entscheidungsgründe</w:t>
       </w:r>
     </w:p>
     <w:p>
       <w:pPr>
+        <w:keepNext/>
+        <w:spacing w:before="0" w:after="0" w:line="220" w:lineRule="exact"/>
+      </w:pPr>
+    </w:p>
+    <w:p>
+      <w:pPr>
         <w:pStyle w:val="Heading3"/>
+        <w:keepNext/>
+        <w:spacing w:after="0"/>
       </w:pPr>
       <w:r>
         <w:rPr>
           <w:rFonts w:ascii="Times New Roman" w:hAnsi="Times New Roman"/>
         </w:rPr>
-        <w:t>A — Zur Zulässigkeit</w:t>
+        <w:t>3.1 Zur Zulässigkeit</w:t>
       </w:r>
+    </w:p>
+    <w:p>
+      <w:pPr>
+        <w:keepNext/>
+        <w:spacing w:before="0" w:after="0" w:line="220" w:lineRule="exact"/>
+      </w:pPr>
     </w:p>
     <w:p>
       <w:pPr>
@@ -259,24 +291,40 @@
     <w:p>
       <w:pPr>
         <w:pStyle w:val="Heading3"/>
+        <w:keepNext/>
+        <w:spacing w:after="0"/>
       </w:pPr>
       <w:r>
         <w:rPr>
           <w:rFonts w:ascii="Times New Roman" w:hAnsi="Times New Roman"/>
         </w:rPr>
-        <w:t>B — Zur Begründetheit</w:t>
+        <w:t>3.2 Zur Begründetheit</w:t>
       </w:r>
     </w:p>
     <w:p>
       <w:pPr>
+        <w:keepNext/>
+        <w:spacing w:before="0" w:after="0" w:line="220" w:lineRule="exact"/>
+      </w:pPr>
+    </w:p>
+    <w:p>
+      <w:pPr>
+        <w:keepNext/>
+        <w:spacing w:after="0"/>
         <w:jc w:val="left"/>
       </w:pPr>
       <w:r>
         <w:rPr>
           <w:b/>
         </w:rPr>
-        <w:t>I. Schadensersatz Baumängel (§ 634 Nr. 4 i.V.m. § 280 Abs. 1, § 281 BGB)</w:t>
+        <w:t>3.2.1 Schadensersatz Baumängel (§ 634 Nr. 4 i.V.m. § 280 Abs. 1, § 281 BGB)</w:t>
       </w:r>
+    </w:p>
+    <w:p>
+      <w:pPr>
+        <w:keepNext/>
+        <w:spacing w:before="0" w:after="0" w:line="220" w:lineRule="exact"/>
+      </w:pPr>
     </w:p>
     <w:p>
       <w:pPr>
@@ -334,14 +382,22 @@
     </w:p>
     <w:p>
       <w:pPr>
+        <w:keepNext/>
+        <w:spacing w:after="0"/>
         <w:jc w:val="left"/>
       </w:pPr>
       <w:r>
         <w:rPr>
           <w:b/>
         </w:rPr>
-        <w:t>II. Folgemängelschäden (§ 634 Nr. 4 i.V.m. § 280 Abs. 1 BGB)</w:t>
+        <w:t>3.2.2 Folgemängelschäden (§ 634 Nr. 4 i.V.m. § 280 Abs. 1 BGB)</w:t>
       </w:r>
+    </w:p>
+    <w:p>
+      <w:pPr>
+        <w:keepNext/>
+        <w:spacing w:before="0" w:after="0" w:line="220" w:lineRule="exact"/>
+      </w:pPr>
     </w:p>
     <w:p>
       <w:pPr>
@@ -353,14 +409,22 @@
     </w:p>
     <w:p>
       <w:pPr>
+        <w:keepNext/>
+        <w:spacing w:after="0"/>
         <w:jc w:val="left"/>
       </w:pPr>
       <w:r>
         <w:rPr>
           <w:b/>
         </w:rPr>
-        <w:t>III. Bodenaustausch / AGB-Klausel</w:t>
+        <w:t>3.2.3 Bodenaustausch / AGB-Klausel</w:t>
       </w:r>
+    </w:p>
+    <w:p>
+      <w:pPr>
+        <w:keepNext/>
+        <w:spacing w:before="0" w:after="0" w:line="220" w:lineRule="exact"/>
+      </w:pPr>
     </w:p>
     <w:p>
       <w:pPr>
@@ -381,14 +445,22 @@
     </w:p>
     <w:p>
       <w:pPr>
+        <w:keepNext/>
+        <w:spacing w:after="0"/>
         <w:jc w:val="left"/>
       </w:pPr>
       <w:r>
         <w:rPr>
           <w:b/>
         </w:rPr>
-        <w:t>IV. Verzögerungsschaden</w:t>
+        <w:t>3.2.4 Verzögerungsschaden</w:t>
       </w:r>
+    </w:p>
+    <w:p>
+      <w:pPr>
+        <w:keepNext/>
+        <w:spacing w:before="0" w:after="0" w:line="220" w:lineRule="exact"/>
+      </w:pPr>
     </w:p>
     <w:p>
       <w:pPr>
@@ -409,14 +481,22 @@
     </w:p>
     <w:p>
       <w:pPr>
+        <w:keepNext/>
+        <w:spacing w:after="0"/>
         <w:jc w:val="left"/>
       </w:pPr>
       <w:r>
         <w:rPr>
           <w:b/>
         </w:rPr>
-        <w:t>V. Minderung (§ 638 BGB)</w:t>
+        <w:t>3.2.5 Minderung (§ 638 BGB)</w:t>
       </w:r>
+    </w:p>
+    <w:p>
+      <w:pPr>
+        <w:keepNext/>
+        <w:spacing w:before="0" w:after="0" w:line="220" w:lineRule="exact"/>
+      </w:pPr>
     </w:p>
     <w:p>
       <w:pPr>
@@ -428,14 +508,22 @@
     </w:p>
     <w:p>
       <w:pPr>
+        <w:keepNext/>
+        <w:spacing w:after="0"/>
         <w:jc w:val="left"/>
       </w:pPr>
       <w:r>
         <w:rPr>
           <w:b/>
         </w:rPr>
-        <w:t>VI. Abgewiesene Positionen</w:t>
+        <w:t>3.2.6 Abgewiesene Positionen</w:t>
       </w:r>
+    </w:p>
+    <w:p>
+      <w:pPr>
+        <w:keepNext/>
+        <w:spacing w:before="0" w:after="0" w:line="220" w:lineRule="exact"/>
+      </w:pPr>
     </w:p>
     <w:p>
       <w:pPr>
@@ -463,13 +551,21 @@
     <w:p>
       <w:pPr>
         <w:pStyle w:val="Heading2"/>
+        <w:keepNext/>
+        <w:spacing w:after="0"/>
       </w:pPr>
       <w:r>
         <w:rPr>
           <w:rFonts w:ascii="Times New Roman" w:hAnsi="Times New Roman"/>
         </w:rPr>
-        <w:t>Kostenentscheidung</w:t>
+        <w:t>4 Kostenentscheidung</w:t>
       </w:r>
+    </w:p>
+    <w:p>
+      <w:pPr>
+        <w:keepNext/>
+        <w:spacing w:before="0" w:after="0" w:line="220" w:lineRule="exact"/>
+      </w:pPr>
     </w:p>
     <w:p>
       <w:pPr>
@@ -483,13 +579,21 @@
     <w:p>
       <w:pPr>
         <w:pStyle w:val="Heading2"/>
+        <w:keepNext/>
+        <w:spacing w:after="0"/>
       </w:pPr>
       <w:r>
         <w:rPr>
           <w:rFonts w:ascii="Times New Roman" w:hAnsi="Times New Roman"/>
         </w:rPr>
-        <w:t>Berufung</w:t>
+        <w:t>5 Berufung</w:t>
       </w:r>
+    </w:p>
+    <w:p>
+      <w:pPr>
+        <w:keepNext/>
+        <w:spacing w:before="0" w:after="0" w:line="220" w:lineRule="exact"/>
+      </w:pPr>
     </w:p>
     <w:p>
       <w:pPr>
@@ -528,7 +632,7 @@
         <w:jc w:val="left"/>
       </w:pPr>
       <w:r>
-        <w:t>Berufungsfrist: 05.09.2027.</w:t>
+        <w:t>Berufungsfrist: Montag, 06.09.2027 (§ 222 Abs. 1 und 2 ZPO i.V.m. §§ 187 Abs. 1, 188 Abs. 2 BGB; rechnerischer Fristablauf am Sonntag, 05.09.2027).</w:t>
       </w:r>
     </w:p>
     <w:p>

</xml_diff>